<commit_message>
Design doc: add group members (M Shazam Khan 22K4207, Hasnain Raza 22K4284)
Also fix PDF builder mermaid regex to tolerate CRLF line endings.

Co-Authored-By: Claude Opus 4.8 <noreply@anthropic.com>
</commit_message>
<xml_diff>
--- a/docs/DESIGN.docx
+++ b/docs/DESIGN.docx
@@ -84,10 +84,10 @@
           <w:b/>
           <w:bCs/>
         </w:rPr>
-        <w:t xml:space="preserve">Cloud target:  </w:t>
-      </w:r>
-      <w:r>
-        <w:t xml:space="preserve">Amazon Web Services (ECS Fargate + Lambda)</w:t>
+        <w:t xml:space="preserve">Group members:  </w:t>
+      </w:r>
+      <w:r>
+        <w:t xml:space="preserve">M Shazam Khan (22K4207) · Hasnain Raza (22K4284)</w:t>
       </w:r>
     </w:p>
     <w:p>
@@ -100,10 +100,90 @@
           <w:b/>
           <w:bCs/>
         </w:rPr>
+        <w:t xml:space="preserve">Cloud target:  </w:t>
+      </w:r>
+      <w:r>
+        <w:t xml:space="preserve">Amazon Web Services (ECS Fargate + Lambda)</w:t>
+      </w:r>
+    </w:p>
+    <w:p>
+      <w:pPr>
+        <w:spacing w:after="80"/>
+        <w:jc w:val="center"/>
+      </w:pPr>
+      <w:r>
+        <w:rPr>
+          <w:b/>
+          <w:bCs/>
+        </w:rPr>
         <w:t xml:space="preserve">IaC:  </w:t>
       </w:r>
       <w:r>
         <w:t xml:space="preserve">AWS CloudFormation (YAML) · CI/CD: GitHub Actions</w:t>
+      </w:r>
+    </w:p>
+    <w:p>
+      <w:pPr>
+        <w:spacing w:after="80"/>
+        <w:jc w:val="center"/>
+      </w:pPr>
+      <w:r>
+        <w:rPr>
+          <w:b/>
+          <w:bCs/>
+        </w:rPr>
+        <w:t xml:space="preserve">Actors:  </w:t>
+      </w:r>
+      <w:r>
+        <w:t xml:space="preserve">- Customer — browses products, manages a cart, places and pays for orders.</w:t>
+      </w:r>
+    </w:p>
+    <w:p>
+      <w:pPr>
+        <w:spacing w:after="80"/>
+        <w:jc w:val="center"/>
+      </w:pPr>
+      <w:r>
+        <w:rPr>
+          <w:b/>
+          <w:bCs/>
+        </w:rPr>
+        <w:t xml:space="preserve">External systems:  </w:t>
+      </w:r>
+      <w:r>
+        <w:t xml:space="preserve">- Stripe — hosted card checkout + webhooks for payment confirmation.</w:t>
+      </w:r>
+    </w:p>
+    <w:p>
+      <w:pPr>
+        <w:spacing w:after="80"/>
+        <w:jc w:val="center"/>
+      </w:pPr>
+      <w:r>
+        <w:rPr>
+          <w:b/>
+          <w:bCs/>
+        </w:rPr>
+        <w:t xml:space="preserve">Why this split (ECS for the API, Lambda for events)?:  </w:t>
+      </w:r>
+      <w:r>
+        <w:t xml:space="preserve">- The Express API is a long-running request/response service with steady traffic</w:t>
+      </w:r>
+    </w:p>
+    <w:p>
+      <w:pPr>
+        <w:spacing w:after="80"/>
+        <w:jc w:val="center"/>
+      </w:pPr>
+      <w:r>
+        <w:rPr>
+          <w:b/>
+          <w:bCs/>
+        </w:rPr>
+        <w:t xml:space="preserve">CloudFormation:  </w:t>
+      </w:r>
+      <w:r>
+        <w:t xml:space="preserve">and shipped through an automated GitHub Actions pipeline.</w:t>
       </w:r>
     </w:p>
     <w:p>
@@ -142,6 +222,87 @@
       <w:r>
         <w:br w:type="page"/>
       </w:r>
+    </w:p>
+    <w:p>
+      <w:pPr>
+        <w:spacing w:after="120"/>
+      </w:pPr>
+      <w:r>
+        <w:t xml:space="preserve">leMate — Architecture &amp; Deployment Design</w:t>
+      </w:r>
+    </w:p>
+    <w:p>
+      <w:pPr>
+        <w:spacing w:after="120"/>
+      </w:pPr>
+      <w:r>
+        <w:rPr>
+          <w:b/>
+          <w:bCs/>
+        </w:rPr>
+        <w:t xml:space="preserve">Project:</w:t>
+      </w:r>
+      <w:r>
+        <w:t xml:space="preserve"> SoleMate (footwear ecommerce platform) </w:t>
+      </w:r>
+      <w:r>
+        <w:rPr>
+          <w:b/>
+          <w:bCs/>
+        </w:rPr>
+        <w:t xml:space="preserve">Document type:</w:t>
+      </w:r>
+      <w:r>
+        <w:t xml:space="preserve"> Architecture &amp; DevOps design </w:t>
+      </w:r>
+      <w:r>
+        <w:rPr>
+          <w:b/>
+          <w:bCs/>
+        </w:rPr>
+        <w:t xml:space="preserve">Group members:</w:t>
+      </w:r>
+      <w:r>
+        <w:t xml:space="preserve"> M Shazam Khan (22K4207) · Hasnain Raza (22K4284) </w:t>
+      </w:r>
+      <w:r>
+        <w:rPr>
+          <w:b/>
+          <w:bCs/>
+        </w:rPr>
+        <w:t xml:space="preserve">Cloud target:</w:t>
+      </w:r>
+      <w:r>
+        <w:t xml:space="preserve"> Amazon Web Services (ECS Fargate + Lambda) </w:t>
+      </w:r>
+      <w:r>
+        <w:rPr>
+          <w:b/>
+          <w:bCs/>
+        </w:rPr>
+        <w:t xml:space="preserve">IaC:</w:t>
+      </w:r>
+      <w:r>
+        <w:t xml:space="preserve"> AWS CloudFormation (YAML) · </w:t>
+      </w:r>
+      <w:r>
+        <w:rPr>
+          <w:b/>
+          <w:bCs/>
+        </w:rPr>
+        <w:t xml:space="preserve">CI/CD:</w:t>
+      </w:r>
+      <w:r>
+        <w:t xml:space="preserve"> GitHub Actions</w:t>
+      </w:r>
+    </w:p>
+    <w:p>
+      <w:pPr>
+        <w:pBdr>
+          <w:bottom w:val="single" w:color="DDDDDD" w:sz="6" w:space="1"/>
+        </w:pBdr>
+        <w:spacing w:after="120"/>
+      </w:pPr>
     </w:p>
     <w:p>
       <w:pPr>

</xml_diff>

<commit_message>
Design doc: add a proper DevOps Project cover page
Cover page (docx + pdf): product name, 'DevOps Project', subtitle, and a
'Submitted by' block with both group members + IDs. Normalize CRLF in the
builders so the title-block split and cover metadata parse correctly.

Co-Authored-By: Claude Opus 4.8 <noreply@anthropic.com>
</commit_message>
<xml_diff>
--- a/docs/DESIGN.docx
+++ b/docs/DESIGN.docx
@@ -4,12 +4,12 @@
   <w:body>
     <w:p>
       <w:pPr>
-        <w:spacing w:before="2400"/>
-      </w:pPr>
-    </w:p>
-    <w:p>
-      <w:pPr>
-        <w:spacing w:after="200"/>
+        <w:spacing w:before="1800"/>
+      </w:pPr>
+    </w:p>
+    <w:p>
+      <w:pPr>
+        <w:spacing w:after="120"/>
         <w:jc w:val="center"/>
       </w:pPr>
       <w:r>
@@ -17,10 +17,26 @@
           <w:b/>
           <w:bCs/>
           <w:color w:val="1F3A5F"/>
-          <w:sz w:val="48"/>
-          <w:szCs w:val="48"/>
-        </w:rPr>
-        <w:t xml:space="preserve">SoleMate — Architecture &amp; Deployment Design</w:t>
+          <w:sz w:val="64"/>
+          <w:szCs w:val="64"/>
+        </w:rPr>
+        <w:t xml:space="preserve">SoleMate</w:t>
+      </w:r>
+    </w:p>
+    <w:p>
+      <w:pPr>
+        <w:spacing w:after="220"/>
+        <w:jc w:val="center"/>
+      </w:pPr>
+      <w:r>
+        <w:rPr>
+          <w:b/>
+          <w:bCs/>
+          <w:color w:val="2E5A88"/>
+          <w:sz w:val="36"/>
+          <w:szCs w:val="36"/>
+        </w:rPr>
+        <w:t xml:space="preserve">DevOps Project</w:t>
       </w:r>
     </w:p>
     <w:p>
@@ -28,7 +44,7 @@
         <w:pBdr>
           <w:bottom w:val="single" w:color="2E5A88" w:sz="8" w:space="4"/>
         </w:pBdr>
-        <w:spacing w:after="600"/>
+        <w:spacing w:after="700"/>
         <w:jc w:val="center"/>
       </w:pPr>
       <w:r>
@@ -39,8 +55,55 @@
           <w:sz w:val="26"/>
           <w:szCs w:val="26"/>
         </w:rPr>
-        <w:t xml:space="preserve">Architecture &amp; DevOps Design Document</w:t>
-      </w:r>
+        <w:t xml:space="preserve">Architecture &amp; Deployment Design Document</w:t>
+      </w:r>
+    </w:p>
+    <w:p>
+      <w:pPr>
+        <w:spacing w:after="120"/>
+        <w:jc w:val="center"/>
+      </w:pPr>
+      <w:r>
+        <w:rPr>
+          <w:b/>
+          <w:bCs/>
+          <w:color w:val="1F3A5F"/>
+          <w:sz w:val="24"/>
+          <w:szCs w:val="24"/>
+        </w:rPr>
+        <w:t xml:space="preserve">Submitted by</w:t>
+      </w:r>
+    </w:p>
+    <w:p>
+      <w:pPr>
+        <w:spacing w:after="60"/>
+        <w:jc w:val="center"/>
+      </w:pPr>
+      <w:r>
+        <w:rPr>
+          <w:sz w:val="24"/>
+          <w:szCs w:val="24"/>
+        </w:rPr>
+        <w:t xml:space="preserve">M Shazam Khan (22K4207)</w:t>
+      </w:r>
+    </w:p>
+    <w:p>
+      <w:pPr>
+        <w:spacing w:after="60"/>
+        <w:jc w:val="center"/>
+      </w:pPr>
+      <w:r>
+        <w:rPr>
+          <w:sz w:val="24"/>
+          <w:szCs w:val="24"/>
+        </w:rPr>
+        <w:t xml:space="preserve">Hasnain Raza (22K4284)</w:t>
+      </w:r>
+    </w:p>
+    <w:p>
+      <w:pPr>
+        <w:spacing w:after="500"/>
+      </w:pPr>
     </w:p>
     <w:p>
       <w:pPr>
@@ -51,10 +114,18 @@
         <w:rPr>
           <w:b/>
           <w:bCs/>
+          <w:color w:val="555555"/>
+          <w:sz w:val="18"/>
+          <w:szCs w:val="18"/>
         </w:rPr>
         <w:t xml:space="preserve">Project:  </w:t>
       </w:r>
       <w:r>
+        <w:rPr>
+          <w:color w:val="555555"/>
+          <w:sz w:val="18"/>
+          <w:szCs w:val="18"/>
+        </w:rPr>
         <w:t xml:space="preserve">SoleMate (footwear ecommerce platform)</w:t>
       </w:r>
     </w:p>
@@ -67,10 +138,18 @@
         <w:rPr>
           <w:b/>
           <w:bCs/>
+          <w:color w:val="555555"/>
+          <w:sz w:val="18"/>
+          <w:szCs w:val="18"/>
         </w:rPr>
         <w:t xml:space="preserve">Document type:  </w:t>
       </w:r>
       <w:r>
+        <w:rPr>
+          <w:color w:val="555555"/>
+          <w:sz w:val="18"/>
+          <w:szCs w:val="18"/>
+        </w:rPr>
         <w:t xml:space="preserve">Architecture &amp; DevOps design</w:t>
       </w:r>
     </w:p>
@@ -83,11 +162,19 @@
         <w:rPr>
           <w:b/>
           <w:bCs/>
-        </w:rPr>
-        <w:t xml:space="preserve">Group members:  </w:t>
-      </w:r>
-      <w:r>
-        <w:t xml:space="preserve">M Shazam Khan (22K4207) · Hasnain Raza (22K4284)</w:t>
+          <w:color w:val="555555"/>
+          <w:sz w:val="18"/>
+          <w:szCs w:val="18"/>
+        </w:rPr>
+        <w:t xml:space="preserve">Cloud target:  </w:t>
+      </w:r>
+      <w:r>
+        <w:rPr>
+          <w:color w:val="555555"/>
+          <w:sz w:val="18"/>
+          <w:szCs w:val="18"/>
+        </w:rPr>
+        <w:t xml:space="preserve">Amazon Web Services (ECS Fargate + Lambda)</w:t>
       </w:r>
     </w:p>
     <w:p>
@@ -99,91 +186,19 @@
         <w:rPr>
           <w:b/>
           <w:bCs/>
-        </w:rPr>
-        <w:t xml:space="preserve">Cloud target:  </w:t>
-      </w:r>
-      <w:r>
-        <w:t xml:space="preserve">Amazon Web Services (ECS Fargate + Lambda)</w:t>
-      </w:r>
-    </w:p>
-    <w:p>
-      <w:pPr>
-        <w:spacing w:after="80"/>
-        <w:jc w:val="center"/>
-      </w:pPr>
-      <w:r>
-        <w:rPr>
-          <w:b/>
-          <w:bCs/>
+          <w:color w:val="555555"/>
+          <w:sz w:val="18"/>
+          <w:szCs w:val="18"/>
         </w:rPr>
         <w:t xml:space="preserve">IaC:  </w:t>
       </w:r>
       <w:r>
+        <w:rPr>
+          <w:color w:val="555555"/>
+          <w:sz w:val="18"/>
+          <w:szCs w:val="18"/>
+        </w:rPr>
         <w:t xml:space="preserve">AWS CloudFormation (YAML) · CI/CD: GitHub Actions</w:t>
-      </w:r>
-    </w:p>
-    <w:p>
-      <w:pPr>
-        <w:spacing w:after="80"/>
-        <w:jc w:val="center"/>
-      </w:pPr>
-      <w:r>
-        <w:rPr>
-          <w:b/>
-          <w:bCs/>
-        </w:rPr>
-        <w:t xml:space="preserve">Actors:  </w:t>
-      </w:r>
-      <w:r>
-        <w:t xml:space="preserve">- Customer — browses products, manages a cart, places and pays for orders.</w:t>
-      </w:r>
-    </w:p>
-    <w:p>
-      <w:pPr>
-        <w:spacing w:after="80"/>
-        <w:jc w:val="center"/>
-      </w:pPr>
-      <w:r>
-        <w:rPr>
-          <w:b/>
-          <w:bCs/>
-        </w:rPr>
-        <w:t xml:space="preserve">External systems:  </w:t>
-      </w:r>
-      <w:r>
-        <w:t xml:space="preserve">- Stripe — hosted card checkout + webhooks for payment confirmation.</w:t>
-      </w:r>
-    </w:p>
-    <w:p>
-      <w:pPr>
-        <w:spacing w:after="80"/>
-        <w:jc w:val="center"/>
-      </w:pPr>
-      <w:r>
-        <w:rPr>
-          <w:b/>
-          <w:bCs/>
-        </w:rPr>
-        <w:t xml:space="preserve">Why this split (ECS for the API, Lambda for events)?:  </w:t>
-      </w:r>
-      <w:r>
-        <w:t xml:space="preserve">- The Express API is a long-running request/response service with steady traffic</w:t>
-      </w:r>
-    </w:p>
-    <w:p>
-      <w:pPr>
-        <w:spacing w:after="80"/>
-        <w:jc w:val="center"/>
-      </w:pPr>
-      <w:r>
-        <w:rPr>
-          <w:b/>
-          <w:bCs/>
-        </w:rPr>
-        <w:t xml:space="preserve">CloudFormation:  </w:t>
-      </w:r>
-      <w:r>
-        <w:t xml:space="preserve">and shipped through an automated GitHub Actions pipeline.</w:t>
       </w:r>
     </w:p>
     <w:p>
@@ -222,87 +237,6 @@
       <w:r>
         <w:br w:type="page"/>
       </w:r>
-    </w:p>
-    <w:p>
-      <w:pPr>
-        <w:spacing w:after="120"/>
-      </w:pPr>
-      <w:r>
-        <w:t xml:space="preserve">leMate — Architecture &amp; Deployment Design</w:t>
-      </w:r>
-    </w:p>
-    <w:p>
-      <w:pPr>
-        <w:spacing w:after="120"/>
-      </w:pPr>
-      <w:r>
-        <w:rPr>
-          <w:b/>
-          <w:bCs/>
-        </w:rPr>
-        <w:t xml:space="preserve">Project:</w:t>
-      </w:r>
-      <w:r>
-        <w:t xml:space="preserve"> SoleMate (footwear ecommerce platform) </w:t>
-      </w:r>
-      <w:r>
-        <w:rPr>
-          <w:b/>
-          <w:bCs/>
-        </w:rPr>
-        <w:t xml:space="preserve">Document type:</w:t>
-      </w:r>
-      <w:r>
-        <w:t xml:space="preserve"> Architecture &amp; DevOps design </w:t>
-      </w:r>
-      <w:r>
-        <w:rPr>
-          <w:b/>
-          <w:bCs/>
-        </w:rPr>
-        <w:t xml:space="preserve">Group members:</w:t>
-      </w:r>
-      <w:r>
-        <w:t xml:space="preserve"> M Shazam Khan (22K4207) · Hasnain Raza (22K4284) </w:t>
-      </w:r>
-      <w:r>
-        <w:rPr>
-          <w:b/>
-          <w:bCs/>
-        </w:rPr>
-        <w:t xml:space="preserve">Cloud target:</w:t>
-      </w:r>
-      <w:r>
-        <w:t xml:space="preserve"> Amazon Web Services (ECS Fargate + Lambda) </w:t>
-      </w:r>
-      <w:r>
-        <w:rPr>
-          <w:b/>
-          <w:bCs/>
-        </w:rPr>
-        <w:t xml:space="preserve">IaC:</w:t>
-      </w:r>
-      <w:r>
-        <w:t xml:space="preserve"> AWS CloudFormation (YAML) · </w:t>
-      </w:r>
-      <w:r>
-        <w:rPr>
-          <w:b/>
-          <w:bCs/>
-        </w:rPr>
-        <w:t xml:space="preserve">CI/CD:</w:t>
-      </w:r>
-      <w:r>
-        <w:t xml:space="preserve"> GitHub Actions</w:t>
-      </w:r>
-    </w:p>
-    <w:p>
-      <w:pPr>
-        <w:pBdr>
-          <w:bottom w:val="single" w:color="DDDDDD" w:sz="6" w:space="1"/>
-        </w:pBdr>
-        <w:spacing w:after="120"/>
-      </w:pPr>
     </w:p>
     <w:p>
       <w:pPr>

</xml_diff>